<commit_message>
Release 5.1.1 - Headless
</commit_message>
<xml_diff>
--- a/link_eshopworld/Documentation/eShopWorld_ABTasty_Integration.docx
+++ b/link_eshopworld/Documentation/eShopWorld_ABTasty_Integration.docx
@@ -152,7 +152,28 @@
                                     <w:sz w:val="20"/>
                                     <w:szCs w:val="20"/>
                                   </w:rPr>
-                                  <w:t>5.0.0</w:t>
+                                  <w:t>5.</w:t>
+                                </w:r>
+                                <w:r>
+                                  <w:rPr>
+                                    <w:sz w:val="20"/>
+                                    <w:szCs w:val="20"/>
+                                  </w:rPr>
+                                  <w:t>1</w:t>
+                                </w:r>
+                                <w:r>
+                                  <w:rPr>
+                                    <w:sz w:val="20"/>
+                                    <w:szCs w:val="20"/>
+                                  </w:rPr>
+                                  <w:t>.</w:t>
+                                </w:r>
+                                <w:r>
+                                  <w:rPr>
+                                    <w:sz w:val="20"/>
+                                    <w:szCs w:val="20"/>
+                                  </w:rPr>
+                                  <w:t>1</w:t>
                                 </w:r>
                               </w:p>
                               <w:p>
@@ -184,7 +205,7 @@
                                     <w:sz w:val="20"/>
                                     <w:szCs w:val="20"/>
                                   </w:rPr>
-                                  <w:t>February</w:t>
+                                  <w:t>June</w:t>
                                 </w:r>
                                 <w:r>
                                   <w:rPr>
@@ -301,7 +322,28 @@
                               <w:sz w:val="20"/>
                               <w:szCs w:val="20"/>
                             </w:rPr>
-                            <w:t>5.0.0</w:t>
+                            <w:t>5.</w:t>
+                          </w:r>
+                          <w:r>
+                            <w:rPr>
+                              <w:sz w:val="20"/>
+                              <w:szCs w:val="20"/>
+                            </w:rPr>
+                            <w:t>1</w:t>
+                          </w:r>
+                          <w:r>
+                            <w:rPr>
+                              <w:sz w:val="20"/>
+                              <w:szCs w:val="20"/>
+                            </w:rPr>
+                            <w:t>.</w:t>
+                          </w:r>
+                          <w:r>
+                            <w:rPr>
+                              <w:sz w:val="20"/>
+                              <w:szCs w:val="20"/>
+                            </w:rPr>
+                            <w:t>1</w:t>
                           </w:r>
                         </w:p>
                         <w:p>
@@ -333,7 +375,7 @@
                               <w:sz w:val="20"/>
                               <w:szCs w:val="20"/>
                             </w:rPr>
-                            <w:t>February</w:t>
+                            <w:t>June</w:t>
                           </w:r>
                           <w:r>
                             <w:rPr>

</xml_diff>